<commit_message>
Editable issue date, 125PLNV50 template fix, directory sync, period-aware ulotki
- Policy DOCX: {{data_wystawienia}} in signature block; wizard date field
  (default today) stored on GeneratedPolicy (migration 1_policy_issue_date)
- Template converter: no more duplicated A-A; bank account lands in its own
  table cell (fixes 125PLNV50 and blank forms); all 13 revalidated
- Issuance syncs edited phone/email back to the SchoolRecord directory
- Ulotki: 10 new PDFs registered; flyers now match payment x period (1 rok /
  2 lata) x variant combo; field->role maps computed offline (geometry+labels,
  handles blank AcroForm templates); OKRES band filled from the actual policy

Co-Authored-By: Claude Opus 4.8 <noreply@anthropic.com>
</commit_message>
<xml_diff>
--- a/templates/policies/125PLNV50.docx
+++ b/templates/policies/125PLNV50.docx
@@ -660,7 +660,7 @@
           <w:sz w:val="28"/>
           <w:szCs w:val="28"/>
         </w:rPr>
-        <w:t xml:space="preserve">Wniosek/Polisa A-A {{numer_polisy}}</w:t>
+        <w:t xml:space="preserve">Wniosek/Polisa </w:t>
       </w:r>
       <w:r>
         <w:rPr>
@@ -674,7 +674,7 @@
           <w:szCs w:val="30"/>
           <w:lang w:val="en-US" w:eastAsia="en-US" w:bidi="ar-SA"/>
         </w:rPr>
-        <w:t>A-A</w:t>
+        <w:t>A-A {{numer_polisy}}</w:t>
       </w:r>
       <w:r>
         <w:rPr>
@@ -16030,7 +16030,7 @@
                 <w:szCs w:val="18"/>
                 <w:lang w:eastAsia="en-US" w:bidi="ar-SA"/>
               </w:rPr>
-              <w:t>InterRisk TU S.A. Vienna Insurance Group {{numer_konta_bankowego}}</w:t>
+              <w:t>InterRisk TU S.A. Vienna Insurance Group</w:t>
             </w:r>
           </w:p>
         </w:tc>
@@ -16060,6 +16060,14 @@
             </w:pPr>
             <w:r>
               <w:rPr/>
+            </w:r>
+            <w:r>
+              <w:rPr>
+                <w:rFonts w:ascii="Arial" w:hAnsi="Arial"/>
+                <w:sz w:val="16"/>
+                <w:szCs w:val="16"/>
+              </w:rPr>
+              <w:t>{{numer_konta_bankowego}}</w:t>
             </w:r>
           </w:p>
         </w:tc>
@@ -27876,7 +27884,7 @@
         <w:rPr>
           <w:spacing w:val="16"/>
         </w:rPr>
-        <w:t xml:space="preserve"> 16.06.2026</w:t>
+        <w:t xml:space="preserve">{{data_wystawienia}}</w:t>
       </w:r>
       <w:r>
         <w:rPr/>

</xml_diff>